<commit_message>
Update Bài 11 and add Bài 12
</commit_message>
<xml_diff>
--- a/source-lessons/bái 11.docx
+++ b/source-lessons/bái 11.docx
@@ -1064,12 +1064,12 @@
           <wp:inline distB="114300" distT="114300" distL="114300" distR="114300">
             <wp:extent cx="4805808" cy="3986213"/>
             <wp:effectExtent b="0" l="0" r="0" t="0"/>
-            <wp:docPr id="7" name="image3.png"/>
+            <wp:docPr id="7" name="image1.png"/>
             <a:graphic>
               <a:graphicData uri="http://schemas.openxmlformats.org/drawingml/2006/picture">
                 <pic:pic>
                   <pic:nvPicPr>
-                    <pic:cNvPr id="0" name="image3.png"/>
+                    <pic:cNvPr id="0" name="image1.png"/>
                     <pic:cNvPicPr preferRelativeResize="0"/>
                   </pic:nvPicPr>
                   <pic:blipFill>
@@ -1724,12 +1724,12 @@
           <wp:inline distB="114300" distT="114300" distL="114300" distR="114300">
             <wp:extent cx="3562350" cy="3505200"/>
             <wp:effectExtent b="0" l="0" r="0" t="0"/>
-            <wp:docPr id="8" name="image5.png"/>
+            <wp:docPr id="8" name="image2.png"/>
             <a:graphic>
               <a:graphicData uri="http://schemas.openxmlformats.org/drawingml/2006/picture">
                 <pic:pic>
                   <pic:nvPicPr>
-                    <pic:cNvPr id="0" name="image5.png"/>
+                    <pic:cNvPr id="0" name="image2.png"/>
                     <pic:cNvPicPr preferRelativeResize="0"/>
                   </pic:nvPicPr>
                   <pic:blipFill>
@@ -1788,7 +1788,7 @@
           <w:szCs w:val="32"/>
           <w:rtl w:val="0"/>
         </w:rPr>
-        <w:t xml:space="preserve">cái ghế ở cái bàn bên trên.</w:t>
+        <w:t xml:space="preserve">cái ghế ở cái bàn bên trên. / *cái ghế trên cái bàn </w:t>
       </w:r>
     </w:p>
     <w:p>
@@ -1820,7 +1820,39 @@
           <w:szCs w:val="32"/>
           <w:rtl w:val="0"/>
         </w:rPr>
+        <w:t xml:space="preserve">Không có cái bút. / *Cái bút dưới quyển sách </w:t>
+      </w:r>
+    </w:p>
+    <w:p>
+      <w:pPr>
+        <w:rPr>
+          <w:sz w:val="32"/>
+          <w:szCs w:val="32"/>
+        </w:rPr>
+      </w:pPr>
+      <w:r>
+        <w:rPr>
+          <w:sz w:val="32"/>
+          <w:szCs w:val="32"/>
+          <w:rtl w:val="0"/>
+        </w:rPr>
         <w:t xml:space="preserve">c. Quyển sách ở đâu?</w:t>
+      </w:r>
+    </w:p>
+    <w:p>
+      <w:pPr>
+        <w:rPr>
+          <w:sz w:val="32"/>
+          <w:szCs w:val="32"/>
+        </w:rPr>
+      </w:pPr>
+      <w:r>
+        <w:rPr>
+          <w:sz w:val="32"/>
+          <w:szCs w:val="32"/>
+          <w:rtl w:val="0"/>
+        </w:rPr>
+        <w:t xml:space="preserve">Quyển sách ở cái bàn bên cạnh. </w:t>
       </w:r>
     </w:p>
     <w:p>
@@ -1852,12 +1884,12 @@
           <wp:inline distB="114300" distT="114300" distL="114300" distR="114300">
             <wp:extent cx="2952750" cy="2790825"/>
             <wp:effectExtent b="0" l="0" r="0" t="0"/>
-            <wp:docPr id="10" name="image2.png"/>
+            <wp:docPr id="10" name="image5.png"/>
             <a:graphic>
               <a:graphicData uri="http://schemas.openxmlformats.org/drawingml/2006/picture">
                 <pic:pic>
                   <pic:nvPicPr>
-                    <pic:cNvPr id="0" name="image2.png"/>
+                    <pic:cNvPr id="0" name="image5.png"/>
                     <pic:cNvPicPr preferRelativeResize="0"/>
                   </pic:nvPicPr>
                   <pic:blipFill>
@@ -1913,7 +1945,23 @@
           <w:szCs w:val="32"/>
           <w:rtl w:val="0"/>
         </w:rPr>
-        <w:t xml:space="preserve">a. Cái bàn đang để ở đâu? </w:t>
+        <w:t xml:space="preserve">a. Cái bàn đang ở đâu? </w:t>
+      </w:r>
+    </w:p>
+    <w:p>
+      <w:pPr>
+        <w:rPr>
+          <w:sz w:val="32"/>
+          <w:szCs w:val="32"/>
+        </w:rPr>
+      </w:pPr>
+      <w:r>
+        <w:rPr>
+          <w:sz w:val="32"/>
+          <w:szCs w:val="32"/>
+          <w:rtl w:val="0"/>
+        </w:rPr>
+        <w:t xml:space="preserve">Cái bàn ở cái ghế bên cạnh. </w:t>
       </w:r>
     </w:p>
     <w:p>
@@ -1954,6 +2002,22 @@
       </w:pPr>
       <w:r>
         <w:rPr>
+          <w:sz w:val="32"/>
+          <w:szCs w:val="32"/>
+          <w:rtl w:val="0"/>
+        </w:rPr>
+        <w:t xml:space="preserve">Bên dưới cái bàn có quyển sách.</w:t>
+      </w:r>
+    </w:p>
+    <w:p>
+      <w:pPr>
+        <w:rPr>
+          <w:sz w:val="32"/>
+          <w:szCs w:val="32"/>
+        </w:rPr>
+      </w:pPr>
+      <w:r>
+        <w:rPr>
           <w:rtl w:val="0"/>
         </w:rPr>
       </w:r>
@@ -1983,8 +2047,11 @@
       </w:pPr>
       <w:r>
         <w:rPr>
-          <w:rtl w:val="0"/>
-        </w:rPr>
+          <w:sz w:val="32"/>
+          <w:szCs w:val="32"/>
+          <w:rtl w:val="0"/>
+        </w:rPr>
+        <w:t xml:space="preserve">Bên trên cái bàn có cái bút. </w:t>
       </w:r>
     </w:p>
     <w:p>
@@ -2029,12 +2096,12 @@
           <wp:inline distB="114300" distT="114300" distL="114300" distR="114300">
             <wp:extent cx="3971925" cy="2305050"/>
             <wp:effectExtent b="0" l="0" r="0" t="0"/>
-            <wp:docPr id="9" name="image1.png"/>
+            <wp:docPr id="9" name="image3.png"/>
             <a:graphic>
               <a:graphicData uri="http://schemas.openxmlformats.org/drawingml/2006/picture">
                 <pic:pic>
                   <pic:nvPicPr>
-                    <pic:cNvPr id="0" name="image1.png"/>
+                    <pic:cNvPr id="0" name="image3.png"/>
                     <pic:cNvPicPr preferRelativeResize="0"/>
                   </pic:nvPicPr>
                   <pic:blipFill>
@@ -2102,6 +2169,22 @@
       </w:pPr>
       <w:r>
         <w:rPr>
+          <w:sz w:val="32"/>
+          <w:szCs w:val="32"/>
+          <w:rtl w:val="0"/>
+        </w:rPr>
+        <w:t xml:space="preserve">Cái ghế ở cái bàn bên cạnh. </w:t>
+      </w:r>
+    </w:p>
+    <w:p>
+      <w:pPr>
+        <w:rPr>
+          <w:sz w:val="32"/>
+          <w:szCs w:val="32"/>
+        </w:rPr>
+      </w:pPr>
+      <w:r>
+        <w:rPr>
           <w:rtl w:val="0"/>
         </w:rPr>
       </w:r>
@@ -2131,37 +2214,56 @@
       </w:pPr>
       <w:r>
         <w:rPr>
-          <w:rtl w:val="0"/>
-        </w:rPr>
-      </w:r>
-    </w:p>
-    <w:p>
-      <w:pPr>
-        <w:rPr>
-          <w:sz w:val="32"/>
-          <w:szCs w:val="32"/>
-        </w:rPr>
-      </w:pPr>
-      <w:r>
-        <w:rPr>
-          <w:sz w:val="32"/>
-          <w:szCs w:val="32"/>
-          <w:rtl w:val="0"/>
-        </w:rPr>
-        <w:t xml:space="preserve">c. Quyển sách đang để ở đâu?</w:t>
-      </w:r>
-    </w:p>
-    <w:p>
-      <w:pPr>
-        <w:rPr>
-          <w:sz w:val="32"/>
-          <w:szCs w:val="32"/>
-        </w:rPr>
-      </w:pPr>
-      <w:r>
-        <w:rPr>
-          <w:rtl w:val="0"/>
-        </w:rPr>
+          <w:sz w:val="32"/>
+          <w:szCs w:val="32"/>
+          <w:rtl w:val="0"/>
+        </w:rPr>
+        <w:t xml:space="preserve">Cái bút dưới cái bàn. </w:t>
+      </w:r>
+    </w:p>
+    <w:p>
+      <w:pPr>
+        <w:rPr>
+          <w:sz w:val="32"/>
+          <w:szCs w:val="32"/>
+        </w:rPr>
+      </w:pPr>
+      <w:r>
+        <w:rPr>
+          <w:rtl w:val="0"/>
+        </w:rPr>
+      </w:r>
+    </w:p>
+    <w:p>
+      <w:pPr>
+        <w:rPr>
+          <w:sz w:val="32"/>
+          <w:szCs w:val="32"/>
+        </w:rPr>
+      </w:pPr>
+      <w:r>
+        <w:rPr>
+          <w:sz w:val="32"/>
+          <w:szCs w:val="32"/>
+          <w:rtl w:val="0"/>
+        </w:rPr>
+        <w:t xml:space="preserve">c. Quyển sách ở đâu?</w:t>
+      </w:r>
+    </w:p>
+    <w:p>
+      <w:pPr>
+        <w:rPr>
+          <w:sz w:val="32"/>
+          <w:szCs w:val="32"/>
+        </w:rPr>
+      </w:pPr>
+      <w:r>
+        <w:rPr>
+          <w:sz w:val="32"/>
+          <w:szCs w:val="32"/>
+          <w:rtl w:val="0"/>
+        </w:rPr>
+        <w:t xml:space="preserve">Quyển sách ở cái bàn bên trước.</w:t>
       </w:r>
     </w:p>
     <w:p>
@@ -2244,8 +2346,269 @@
       </w:pPr>
       <w:r>
         <w:rPr>
-          <w:rtl w:val="0"/>
-        </w:rPr>
+          <w:sz w:val="32"/>
+          <w:szCs w:val="32"/>
+          <w:rtl w:val="0"/>
+        </w:rPr>
+        <w:t xml:space="preserve">* pod i nad: trên, dưới </w:t>
+      </w:r>
+    </w:p>
+    <w:p>
+      <w:pPr>
+        <w:rPr>
+          <w:sz w:val="32"/>
+          <w:szCs w:val="32"/>
+        </w:rPr>
+      </w:pPr>
+      <w:r>
+        <w:rPr>
+          <w:sz w:val="32"/>
+          <w:szCs w:val="32"/>
+          <w:rtl w:val="0"/>
+        </w:rPr>
+        <w:t xml:space="preserve">możemy z nimi ułożyć zdanie jak po polsku:</w:t>
+      </w:r>
+    </w:p>
+    <w:p>
+      <w:pPr>
+        <w:rPr>
+          <w:sz w:val="32"/>
+          <w:szCs w:val="32"/>
+        </w:rPr>
+      </w:pPr>
+      <w:r>
+        <w:rPr>
+          <w:color w:val="ff0000"/>
+          <w:sz w:val="32"/>
+          <w:szCs w:val="32"/>
+          <w:rtl w:val="0"/>
+        </w:rPr>
+        <w:t xml:space="preserve">książka</w:t>
+      </w:r>
+      <w:r>
+        <w:rPr>
+          <w:sz w:val="32"/>
+          <w:szCs w:val="32"/>
+          <w:rtl w:val="0"/>
+        </w:rPr>
+        <w:t xml:space="preserve"> </w:t>
+      </w:r>
+      <w:r>
+        <w:rPr>
+          <w:color w:val="0000ff"/>
+          <w:sz w:val="32"/>
+          <w:szCs w:val="32"/>
+          <w:rtl w:val="0"/>
+        </w:rPr>
+        <w:t xml:space="preserve">na</w:t>
+      </w:r>
+      <w:r>
+        <w:rPr>
+          <w:sz w:val="32"/>
+          <w:szCs w:val="32"/>
+          <w:rtl w:val="0"/>
+        </w:rPr>
+        <w:t xml:space="preserve"> </w:t>
+      </w:r>
+      <w:r>
+        <w:rPr>
+          <w:color w:val="6aa84f"/>
+          <w:sz w:val="32"/>
+          <w:szCs w:val="32"/>
+          <w:rtl w:val="0"/>
+        </w:rPr>
+        <w:t xml:space="preserve">stole</w:t>
+      </w:r>
+      <w:r>
+        <w:rPr>
+          <w:sz w:val="32"/>
+          <w:szCs w:val="32"/>
+          <w:rtl w:val="0"/>
+        </w:rPr>
+        <w:t xml:space="preserve"> = </w:t>
+      </w:r>
+      <w:r>
+        <w:rPr>
+          <w:color w:val="ff0000"/>
+          <w:sz w:val="32"/>
+          <w:szCs w:val="32"/>
+          <w:rtl w:val="0"/>
+        </w:rPr>
+        <w:t xml:space="preserve">quyển sách</w:t>
+      </w:r>
+      <w:r>
+        <w:rPr>
+          <w:sz w:val="32"/>
+          <w:szCs w:val="32"/>
+          <w:rtl w:val="0"/>
+        </w:rPr>
+        <w:t xml:space="preserve"> </w:t>
+      </w:r>
+      <w:r>
+        <w:rPr>
+          <w:color w:val="0000ff"/>
+          <w:sz w:val="32"/>
+          <w:szCs w:val="32"/>
+          <w:rtl w:val="0"/>
+        </w:rPr>
+        <w:t xml:space="preserve">trên</w:t>
+      </w:r>
+      <w:r>
+        <w:rPr>
+          <w:sz w:val="32"/>
+          <w:szCs w:val="32"/>
+          <w:rtl w:val="0"/>
+        </w:rPr>
+        <w:t xml:space="preserve"> </w:t>
+      </w:r>
+      <w:r>
+        <w:rPr>
+          <w:color w:val="6aa84f"/>
+          <w:sz w:val="32"/>
+          <w:szCs w:val="32"/>
+          <w:rtl w:val="0"/>
+        </w:rPr>
+        <w:t xml:space="preserve">cái bàn</w:t>
+      </w:r>
+      <w:r>
+        <w:rPr>
+          <w:sz w:val="32"/>
+          <w:szCs w:val="32"/>
+          <w:rtl w:val="0"/>
+        </w:rPr>
+        <w:t xml:space="preserve"> </w:t>
+      </w:r>
+    </w:p>
+    <w:p>
+      <w:pPr>
+        <w:rPr>
+          <w:sz w:val="32"/>
+          <w:szCs w:val="32"/>
+        </w:rPr>
+      </w:pPr>
+      <w:r>
+        <w:rPr>
+          <w:sz w:val="32"/>
+          <w:szCs w:val="32"/>
+          <w:rtl w:val="0"/>
+        </w:rPr>
+        <w:t xml:space="preserve">resztę nie :( 🙂</w:t>
+      </w:r>
+    </w:p>
+    <w:p>
+      <w:pPr>
+        <w:rPr>
+          <w:sz w:val="32"/>
+          <w:szCs w:val="32"/>
+        </w:rPr>
+      </w:pPr>
+      <w:r>
+        <w:rPr>
+          <w:rtl w:val="0"/>
+        </w:rPr>
+      </w:r>
+    </w:p>
+    <w:p>
+      <w:pPr>
+        <w:rPr>
+          <w:sz w:val="32"/>
+          <w:szCs w:val="32"/>
+        </w:rPr>
+      </w:pPr>
+      <w:r>
+        <w:rPr>
+          <w:sz w:val="32"/>
+          <w:szCs w:val="32"/>
+          <w:rtl w:val="0"/>
+        </w:rPr>
+        <w:t xml:space="preserve">rzecz 1 + ở + rzecz 2 + bên/phía + kiẻrunek </w:t>
+      </w:r>
+    </w:p>
+    <w:p>
+      <w:pPr>
+        <w:rPr>
+          <w:sz w:val="32"/>
+          <w:szCs w:val="32"/>
+        </w:rPr>
+      </w:pPr>
+      <w:r>
+        <w:rPr>
+          <w:rtl w:val="0"/>
+        </w:rPr>
+      </w:r>
+    </w:p>
+    <w:p>
+      <w:pPr>
+        <w:rPr>
+          <w:sz w:val="32"/>
+          <w:szCs w:val="32"/>
+        </w:rPr>
+      </w:pPr>
+      <w:r>
+        <w:rPr>
+          <w:sz w:val="32"/>
+          <w:szCs w:val="32"/>
+          <w:rtl w:val="0"/>
+        </w:rPr>
+        <w:t xml:space="preserve">Quyển sách ở cái bàn bên cạnh </w:t>
+      </w:r>
+    </w:p>
+    <w:p>
+      <w:pPr>
+        <w:rPr>
+          <w:sz w:val="32"/>
+          <w:szCs w:val="32"/>
+        </w:rPr>
+      </w:pPr>
+      <w:r>
+        <w:rPr>
+          <w:rtl w:val="0"/>
+        </w:rPr>
+      </w:r>
+    </w:p>
+    <w:p>
+      <w:pPr>
+        <w:rPr>
+          <w:sz w:val="32"/>
+          <w:szCs w:val="32"/>
+        </w:rPr>
+      </w:pPr>
+      <w:r>
+        <w:rPr>
+          <w:sz w:val="32"/>
+          <w:szCs w:val="32"/>
+          <w:rtl w:val="0"/>
+        </w:rPr>
+        <w:t xml:space="preserve">đúng - dobrze, poprawnie </w:t>
+      </w:r>
+    </w:p>
+    <w:p>
+      <w:pPr>
+        <w:rPr>
+          <w:sz w:val="32"/>
+          <w:szCs w:val="32"/>
+        </w:rPr>
+      </w:pPr>
+      <w:r>
+        <w:rPr>
+          <w:rtl w:val="0"/>
+        </w:rPr>
+      </w:r>
+    </w:p>
+    <w:p>
+      <w:pPr>
+        <w:rPr>
+          <w:sz w:val="32"/>
+          <w:szCs w:val="32"/>
+        </w:rPr>
+      </w:pPr>
+      <w:r>
+        <w:rPr>
+          <w:sz w:val="32"/>
+          <w:szCs w:val="32"/>
+          <w:rtl w:val="0"/>
+        </w:rPr>
+        <w:t xml:space="preserve">đúng rồi - dobra, dobrze</w:t>
       </w:r>
     </w:p>
     <w:sectPr>

</xml_diff>